<commit_message>
Simulation modeling: Tum guncel dosyalar ve lablar eklendi
</commit_message>
<xml_diff>
--- a/labs/lab02/report/_output/simulation-modeling-lab02-report.docx
+++ b/labs/lab02/report/_output/simulation-modeling-lab02-report.docx
@@ -7,7 +7,7 @@
         <w:pStyle w:val="Title"/>
       </w:pPr>
       <w:r>
-        <w:t xml:space="preserve">Шаблон отчёта по лабораторной работе</w:t>
+        <w:t xml:space="preserve">Структура научной презентации</w:t>
       </w:r>
     </w:p>
     <w:p>
@@ -23,7 +23,15 @@
         <w:pStyle w:val="Author"/>
       </w:pPr>
       <w:r>
-        <w:t xml:space="preserve">Дмитрий Сергеевич Кулябов</w:t>
+        <w:t xml:space="preserve">Mehmet efe kantoz</w:t>
+      </w:r>
+    </w:p>
+    <w:p>
+      <w:pPr>
+        <w:pStyle w:val="Date"/>
+      </w:pPr>
+      <w:r>
+        <w:t xml:space="preserve">2026-09-14</w:t>
       </w:r>
     </w:p>
     <w:sdt>
@@ -52,443 +60,221 @@
         </w:p>
       </w:sdtContent>
     </w:sdt>
-    <w:bookmarkStart w:id="9" w:name="цель-работы"/>
+    <w:bookmarkStart w:id="11" w:name="информация"/>
     <w:p>
       <w:pPr>
         <w:pStyle w:val="Heading1"/>
       </w:pPr>
       <w:r>
-        <w:t xml:space="preserve">1. Цель работы</w:t>
-      </w:r>
-    </w:p>
-    <w:p>
-      <w:pPr>
-        <w:pStyle w:val="FirstParagraph"/>
-      </w:pPr>
-      <w:r>
-        <w:t xml:space="preserve">Здесь приводится формулировка цели лабораторной работы.</w:t>
-      </w:r>
-      <w:r>
-        <w:t xml:space="preserve"> </w:t>
-      </w:r>
-      <w:r>
-        <w:t xml:space="preserve">Формулировки цели для каждой лабораторной работы приведены в методических указаниях.</w:t>
-      </w:r>
-    </w:p>
-    <w:p>
-      <w:pPr>
-        <w:pStyle w:val="BodyText"/>
-      </w:pPr>
-      <w:r>
-        <w:t xml:space="preserve">Цель данного шаблона — максимально упростить подготовку отчётов по лабораторным работам.</w:t>
-      </w:r>
-      <w:r>
-        <w:t xml:space="preserve"> </w:t>
-      </w:r>
-      <w:r>
-        <w:t xml:space="preserve">Модифицируя данный шаблон, студенты смогут без труда подготовить отчёт по лабораторным работам, а также познакомиться с основными возможностями разметки Markdown.</w:t>
-      </w:r>
-    </w:p>
-    <w:bookmarkEnd w:id="9"/>
-    <w:bookmarkStart w:id="10" w:name="задание"/>
-    <w:p>
-      <w:pPr>
-        <w:pStyle w:val="Heading1"/>
-      </w:pPr>
-      <w:r>
-        <w:t xml:space="preserve">2. Задание</w:t>
-      </w:r>
-    </w:p>
-    <w:p>
-      <w:pPr>
-        <w:pStyle w:val="FirstParagraph"/>
-      </w:pPr>
-      <w:r>
-        <w:t xml:space="preserve">Здесь приводится описание задания в соответствии с рекомендациями методического пособия и выданным вариантом.</w:t>
-      </w:r>
-    </w:p>
-    <w:bookmarkEnd w:id="10"/>
-    <w:bookmarkStart w:id="12" w:name="теоретическое-введение"/>
-    <w:p>
-      <w:pPr>
-        <w:pStyle w:val="Heading1"/>
-      </w:pPr>
-      <w:r>
-        <w:t xml:space="preserve">3. Теоретическое введение</w:t>
-      </w:r>
-    </w:p>
-    <w:p>
-      <w:pPr>
-        <w:pStyle w:val="FirstParagraph"/>
-      </w:pPr>
-      <w:r>
-        <w:t xml:space="preserve">Здесь описываются теоретические аспекты, связанные с выполнением работы.</w:t>
-      </w:r>
-    </w:p>
-    <w:p>
-      <w:pPr>
-        <w:pStyle w:val="BodyText"/>
-      </w:pPr>
-      <w:r>
-        <w:t xml:space="preserve">Например, в</w:t>
-      </w:r>
-      <w:r>
-        <w:t xml:space="preserve"> </w:t>
-      </w:r>
-      <w:hyperlink w:anchor="tbl-std-dir">
+        <w:t xml:space="preserve">1. Информация</w:t>
+      </w:r>
+    </w:p>
+    <w:bookmarkStart w:id="10" w:name="докладчик"/>
+    <w:p>
+      <w:pPr>
+        <w:pStyle w:val="Heading2"/>
+      </w:pPr>
+      <w:r>
+        <w:t xml:space="preserve">1.1 Докладчик</w:t>
+      </w:r>
+    </w:p>
+    <w:p>
+      <w:pPr>
+        <w:pStyle w:val="Compact"/>
+        <w:numPr>
+          <w:ilvl w:val="0"/>
+          <w:numId w:val="1001"/>
+        </w:numPr>
+      </w:pPr>
+      <w:r>
+        <w:t xml:space="preserve">Mehmet Efe Kantoz</w:t>
+      </w:r>
+    </w:p>
+    <w:p>
+      <w:pPr>
+        <w:pStyle w:val="Compact"/>
+        <w:numPr>
+          <w:ilvl w:val="0"/>
+          <w:numId w:val="1001"/>
+        </w:numPr>
+      </w:pPr>
+      <w:r>
+        <w:t xml:space="preserve">Ctudent 3 kypc</w:t>
+      </w:r>
+    </w:p>
+    <w:p>
+      <w:pPr>
+        <w:pStyle w:val="Compact"/>
+        <w:numPr>
+          <w:ilvl w:val="0"/>
+          <w:numId w:val="1001"/>
+        </w:numPr>
+      </w:pPr>
+      <w:r>
+        <w:t xml:space="preserve">Российский университет дружбы народов им. П. Лумумбы</w:t>
+      </w:r>
+    </w:p>
+    <w:p>
+      <w:pPr>
+        <w:pStyle w:val="Compact"/>
+        <w:numPr>
+          <w:ilvl w:val="0"/>
+          <w:numId w:val="1001"/>
+        </w:numPr>
+      </w:pPr>
+      <w:hyperlink r:id="rId9">
         <w:r>
           <w:rPr>
             <w:rStyle w:val="Hyperlink"/>
           </w:rPr>
-          <w:t xml:space="preserve">табл. 1</w:t>
+          <w:t xml:space="preserve">1032228428@pfur.ru</w:t>
         </w:r>
       </w:hyperlink>
+    </w:p>
+    <w:bookmarkEnd w:id="10"/>
+    <w:bookmarkEnd w:id="11"/>
+    <w:bookmarkStart w:id="12" w:name="цель-работы"/>
+    <w:p>
+      <w:pPr>
+        <w:pStyle w:val="Heading1"/>
+      </w:pPr>
+      <w:r>
+        <w:t xml:space="preserve">2. Цель работы</w:t>
+      </w:r>
+    </w:p>
+    <w:p>
+      <w:pPr>
+        <w:pStyle w:val="FirstParagraph"/>
+      </w:pPr>
+      <w:r>
+        <w:t xml:space="preserve">Ознакомится с моделью SIR и моделью Лотки–Вольтерры</w:t>
+      </w:r>
+    </w:p>
+    <w:bookmarkEnd w:id="12"/>
+    <w:bookmarkStart w:id="13" w:name="задание"/>
+    <w:p>
+      <w:pPr>
+        <w:pStyle w:val="Heading1"/>
+      </w:pPr>
+      <w:r>
+        <w:t xml:space="preserve">3. Задание</w:t>
+      </w:r>
+    </w:p>
+    <w:p>
+      <w:pPr>
+        <w:pStyle w:val="FirstParagraph"/>
+      </w:pPr>
+      <w:r>
+        <w:t xml:space="preserve">Здесь приводится описание задания в соответствии с рекомендациями методического пособия и выданным вариантом.</w:t>
+      </w:r>
+    </w:p>
+    <w:bookmarkEnd w:id="13"/>
+    <w:bookmarkStart w:id="14" w:name="теоретическое-введение"/>
+    <w:p>
+      <w:pPr>
+        <w:pStyle w:val="Heading1"/>
+      </w:pPr>
+      <w:r>
+        <w:t xml:space="preserve">4. Теоретическое введение</w:t>
+      </w:r>
+    </w:p>
+    <w:p>
+      <w:pPr>
+        <w:pStyle w:val="FirstParagraph"/>
+      </w:pPr>
+      <w:r>
+        <w:t xml:space="preserve">Модель Лотки–Вольтерры — это фундаментальная математическая модель в экологии, описывающая динамику взаимодействия двух видов: хищников и жертв.</w:t>
+      </w:r>
       <w:r>
         <w:t xml:space="preserve"> </w:t>
       </w:r>
       <w:r>
-        <w:t xml:space="preserve">приведено краткое описание стандартных каталогов Unix.</w:t>
-      </w:r>
-    </w:p>
-    <w:tbl>
-      <w:tblPr>
-        <w:tblStyle w:val="Table"/>
-        <w:tblW w:type="pct" w:w="5000"/>
-        <w:tblLayout w:type="fixed"/>
-        <w:tblLook w:firstRow="0" w:lastRow="0" w:firstColumn="0" w:lastColumn="0" w:noHBand="0" w:noVBand="0" w:val="0000"/>
-      </w:tblPr>
-      <w:tblGrid>
-        <w:gridCol w:w="7920"/>
-      </w:tblGrid>
-      <w:tr>
-        <w:tc>
-          <w:tcPr/>
-          <w:bookmarkStart w:id="11" w:name="tbl-std-dir"/>
-          <w:p>
-            <w:pPr>
-              <w:jc w:val="center"/>
-            </w:pPr>
-            <w:pPr>
-              <w:jc w:val="left"/>
-              <w:spacing w:before="200"/>
-              <w:pStyle w:val="ImageCaption"/>
-            </w:pPr>
-            <w:r>
-              <w:t xml:space="preserve">Таблица 1: Описание некоторых каталогов файловой системы GNU Linux</w:t>
-            </w:r>
-          </w:p>
-          <w:tbl>
-            <w:tblPr>
-              <w:tblStyle w:val="Table"/>
-              <w:tblW w:type="pct" w:w="5000"/>
-              <w:tblLayout w:type="fixed"/>
-              <w:tblLook w:firstRow="1" w:lastRow="0" w:firstColumn="0" w:lastColumn="0" w:noHBand="0" w:noVBand="0" w:val="0020"/>
-            </w:tblPr>
-            <w:tblGrid>
-              <w:gridCol w:w="803"/>
-              <w:gridCol w:w="7116"/>
-            </w:tblGrid>
-            <w:tr>
-              <w:trPr>
-                <w:tblHeader w:val="on"/>
-              </w:trPr>
-              <w:tc>
-                <w:tcPr/>
-                <w:p>
-                  <w:pPr>
-                    <w:pStyle w:val="Compact"/>
-                    <w:jc w:val="center"/>
-                  </w:pPr>
-                  <w:r>
-                    <w:t xml:space="preserve">Имя каталога</w:t>
-                  </w:r>
-                </w:p>
-              </w:tc>
-              <w:tc>
-                <w:tcPr/>
-                <w:p>
-                  <w:pPr>
-                    <w:pStyle w:val="Compact"/>
-                    <w:jc w:val="center"/>
-                  </w:pPr>
-                  <w:r>
-                    <w:t xml:space="preserve">Описание каталога</w:t>
-                  </w:r>
-                </w:p>
-              </w:tc>
-            </w:tr>
-            <w:tr>
-              <w:tc>
-                <w:tcPr/>
-                <w:p>
-                  <w:pPr>
-                    <w:pStyle w:val="Compact"/>
-                    <w:jc w:val="center"/>
-                  </w:pPr>
-                  <w:r>
-                    <w:rPr>
-                      <w:rStyle w:val="VerbatimChar"/>
-                    </w:rPr>
-                    <w:t xml:space="preserve">/</w:t>
-                  </w:r>
-                </w:p>
-              </w:tc>
-              <w:tc>
-                <w:tcPr/>
-                <w:p>
-                  <w:pPr>
-                    <w:pStyle w:val="Compact"/>
-                    <w:jc w:val="center"/>
-                  </w:pPr>
-                  <w:r>
-                    <w:t xml:space="preserve">Корневая директория, содержащая всю файловую</w:t>
-                  </w:r>
-                </w:p>
-              </w:tc>
-            </w:tr>
-            <w:tr>
-              <w:tc>
-                <w:tcPr/>
-                <w:p>
-                  <w:pPr>
-                    <w:pStyle w:val="Compact"/>
-                    <w:jc w:val="center"/>
-                  </w:pPr>
-                  <w:r>
-                    <w:rPr>
-                      <w:rStyle w:val="VerbatimChar"/>
-                    </w:rPr>
-                    <w:t xml:space="preserve">/bin</w:t>
-                  </w:r>
-                </w:p>
-              </w:tc>
-              <w:tc>
-                <w:tcPr/>
-                <w:p>
-                  <w:pPr>
-                    <w:pStyle w:val="Compact"/>
-                    <w:jc w:val="center"/>
-                  </w:pPr>
-                  <w:r>
-                    <w:t xml:space="preserve">Основные системные утилиты, необходимые как в однопользовательском режиме, так и при обычной работе всем пользователям</w:t>
-                  </w:r>
-                </w:p>
-              </w:tc>
-            </w:tr>
-            <w:tr>
-              <w:tc>
-                <w:tcPr/>
-                <w:p>
-                  <w:pPr>
-                    <w:pStyle w:val="Compact"/>
-                    <w:jc w:val="center"/>
-                  </w:pPr>
-                  <w:r>
-                    <w:rPr>
-                      <w:rStyle w:val="VerbatimChar"/>
-                    </w:rPr>
-                    <w:t xml:space="preserve">/etc</w:t>
-                  </w:r>
-                </w:p>
-              </w:tc>
-              <w:tc>
-                <w:tcPr/>
-                <w:p>
-                  <w:pPr>
-                    <w:pStyle w:val="Compact"/>
-                    <w:jc w:val="center"/>
-                  </w:pPr>
-                  <w:r>
-                    <w:t xml:space="preserve">Общесистемные конфигурационные файлы и файлы конфигурации установленных программ</w:t>
-                  </w:r>
-                </w:p>
-              </w:tc>
-            </w:tr>
-            <w:tr>
-              <w:tc>
-                <w:tcPr/>
-                <w:p>
-                  <w:pPr>
-                    <w:pStyle w:val="Compact"/>
-                    <w:jc w:val="center"/>
-                  </w:pPr>
-                  <w:r>
-                    <w:rPr>
-                      <w:rStyle w:val="VerbatimChar"/>
-                    </w:rPr>
-                    <w:t xml:space="preserve">/home</w:t>
-                  </w:r>
-                </w:p>
-              </w:tc>
-              <w:tc>
-                <w:tcPr/>
-                <w:p>
-                  <w:pPr>
-                    <w:pStyle w:val="Compact"/>
-                    <w:jc w:val="center"/>
-                  </w:pPr>
-                  <w:r>
-                    <w:t xml:space="preserve">Содержит домашние директории пользователей, которые, в свою очередь, содержат персональные настройки и данные пользователя</w:t>
-                  </w:r>
-                </w:p>
-              </w:tc>
-            </w:tr>
-            <w:tr>
-              <w:tc>
-                <w:tcPr/>
-                <w:p>
-                  <w:pPr>
-                    <w:pStyle w:val="Compact"/>
-                    <w:jc w:val="center"/>
-                  </w:pPr>
-                  <w:r>
-                    <w:rPr>
-                      <w:rStyle w:val="VerbatimChar"/>
-                    </w:rPr>
-                    <w:t xml:space="preserve">/media</w:t>
-                  </w:r>
-                </w:p>
-              </w:tc>
-              <w:tc>
-                <w:tcPr/>
-                <w:p>
-                  <w:pPr>
-                    <w:pStyle w:val="Compact"/>
-                    <w:jc w:val="center"/>
-                  </w:pPr>
-                  <w:r>
-                    <w:t xml:space="preserve">Точки монтирования для сменных носителей</w:t>
-                  </w:r>
-                </w:p>
-              </w:tc>
-            </w:tr>
-            <w:tr>
-              <w:tc>
-                <w:tcPr/>
-                <w:p>
-                  <w:pPr>
-                    <w:pStyle w:val="Compact"/>
-                    <w:jc w:val="center"/>
-                  </w:pPr>
-                  <w:r>
-                    <w:rPr>
-                      <w:rStyle w:val="VerbatimChar"/>
-                    </w:rPr>
-                    <w:t xml:space="preserve">/root</w:t>
-                  </w:r>
-                </w:p>
-              </w:tc>
-              <w:tc>
-                <w:tcPr/>
-                <w:p>
-                  <w:pPr>
-                    <w:pStyle w:val="Compact"/>
-                    <w:jc w:val="center"/>
-                  </w:pPr>
-                  <w:r>
-                    <w:t xml:space="preserve">Домашняя директория пользователя</w:t>
-                  </w:r>
-                  <w:r>
-                    <w:t xml:space="preserve"> </w:t>
-                  </w:r>
-                  <w:r>
-                    <w:rPr>
-                      <w:rStyle w:val="VerbatimChar"/>
-                    </w:rPr>
-                    <w:t xml:space="preserve">root</w:t>
-                  </w:r>
-                </w:p>
-              </w:tc>
-            </w:tr>
-            <w:tr>
-              <w:tc>
-                <w:tcPr/>
-                <w:p>
-                  <w:pPr>
-                    <w:pStyle w:val="Compact"/>
-                    <w:jc w:val="center"/>
-                  </w:pPr>
-                  <w:r>
-                    <w:rPr>
-                      <w:rStyle w:val="VerbatimChar"/>
-                    </w:rPr>
-                    <w:t xml:space="preserve">/tmp</w:t>
-                  </w:r>
-                </w:p>
-              </w:tc>
-              <w:tc>
-                <w:tcPr/>
-                <w:p>
-                  <w:pPr>
-                    <w:pStyle w:val="Compact"/>
-                    <w:jc w:val="center"/>
-                  </w:pPr>
-                  <w:r>
-                    <w:t xml:space="preserve">Временные файлы</w:t>
-                  </w:r>
-                </w:p>
-              </w:tc>
-            </w:tr>
-            <w:tr>
-              <w:tc>
-                <w:tcPr/>
-                <w:p>
-                  <w:pPr>
-                    <w:pStyle w:val="Compact"/>
-                    <w:jc w:val="center"/>
-                  </w:pPr>
-                  <w:r>
-                    <w:rPr>
-                      <w:rStyle w:val="VerbatimChar"/>
-                    </w:rPr>
-                    <w:t xml:space="preserve">/usr</w:t>
-                  </w:r>
-                </w:p>
-              </w:tc>
-              <w:tc>
-                <w:tcPr/>
-                <w:p>
-                  <w:pPr>
-                    <w:pStyle w:val="Compact"/>
-                    <w:jc w:val="center"/>
-                  </w:pPr>
-                  <w:r>
-                    <w:t xml:space="preserve">Вторичная иерархия для данных пользователя</w:t>
-                  </w:r>
-                </w:p>
-              </w:tc>
-            </w:tr>
-          </w:tbl>
-          <w:bookmarkEnd w:id="11"/>
-          <w:p/>
-        </w:tc>
-      </w:tr>
-    </w:tbl>
+        <w:t xml:space="preserve">Она была независимо предложена в 1920-х годах:</w:t>
+      </w:r>
+    </w:p>
     <w:p>
       <w:pPr>
         <w:pStyle w:val="BodyText"/>
       </w:pPr>
       <w:r>
-        <w:t xml:space="preserve">Более подробно про Unix см. в</w:t>
+        <w:t xml:space="preserve">Модель демонстрирует, как даже простая система взаимодействий может порождать сложные колебательные режимы,</w:t>
       </w:r>
       <w:r>
         <w:t xml:space="preserve"> </w:t>
       </w:r>
       <w:r>
-        <w:t xml:space="preserve">[1–4]</w:t>
-      </w:r>
-      <w:r>
-        <w:t xml:space="preserve">.</w:t>
-      </w:r>
-    </w:p>
-    <w:bookmarkEnd w:id="12"/>
-    <w:bookmarkStart w:id="17" w:name="выполнение-лабораторной-работы"/>
+        <w:t xml:space="preserve">объясняя циклические изменения численности в природных экосистемах.</w:t>
+      </w:r>
+    </w:p>
+    <w:p>
+      <w:pPr>
+        <w:pStyle w:val="BodyText"/>
+      </w:pPr>
+      <w:r>
+        <w:t xml:space="preserve">Модель SIR есть классическая и фундаментальная математическая модель эпидемиологии, описывающая распространение инфекционного заболевания в закрытой популяции</w:t>
+      </w:r>
+    </w:p>
+    <w:p>
+      <w:pPr>
+        <w:pStyle w:val="BodyText"/>
+      </w:pPr>
+      <w:r>
+        <w:t xml:space="preserve">Модель SIR делит всю популяцию на три взаимосвязанные группы (компартменты), что отражено в её названии:</w:t>
+      </w:r>
+      <w:r>
+        <w:t xml:space="preserve"> </w:t>
+      </w:r>
+      <w:r>
+        <w:t xml:space="preserve">- S – Susceptible (Восприимчивые): люди, которые не болели, не имеют иммунитета и могут заразиться.</w:t>
+      </w:r>
+      <w:r>
+        <w:t xml:space="preserve"> </w:t>
+      </w:r>
+      <w:r>
+        <w:t xml:space="preserve">- I – Infectious (Инфицированные/Заразные): люди, которые в данный момент</w:t>
+      </w:r>
+      <w:r>
+        <w:t xml:space="preserve"> </w:t>
+      </w:r>
+      <w:r>
+        <w:t xml:space="preserve">больны и могут передавать инфекцию.</w:t>
+      </w:r>
+      <w:r>
+        <w:t xml:space="preserve"> </w:t>
+      </w:r>
+      <w:r>
+        <w:t xml:space="preserve">- R – Recovered (Выздоровевшие/Удаленные): люди, которые переболели и приобрели иммунитет (или умерли). Они больше не участвуют в процессе передачи.</w:t>
+      </w:r>
+      <w:r>
+        <w:t xml:space="preserve"> </w:t>
+      </w:r>
+      <w:r>
+        <w:t xml:space="preserve">Основная цель модели: не предсказать судьбу конкретного человека, а понять общую динамику эпидемии — будет ли она разрастаться, как быстро, сколько</w:t>
+      </w:r>
+      <w:r>
+        <w:t xml:space="preserve"> </w:t>
+      </w:r>
+      <w:r>
+        <w:t xml:space="preserve">людей в итоге переболеет, как влияют карантинные меры.</w:t>
+      </w:r>
+    </w:p>
+    <w:bookmarkEnd w:id="14"/>
+    <w:bookmarkStart w:id="57" w:name="выполнение-лабораторной-работы"/>
     <w:p>
       <w:pPr>
         <w:pStyle w:val="Heading1"/>
       </w:pPr>
       <w:r>
-        <w:t xml:space="preserve">4. Выполнение лабораторной работы</w:t>
+        <w:t xml:space="preserve">5. Выполнение лабораторной работы</w:t>
+      </w:r>
+    </w:p>
+    <w:bookmarkStart w:id="18" w:name="выполнение-лабораторной-работы-1"/>
+    <w:p>
+      <w:pPr>
+        <w:pStyle w:val="Heading2"/>
+      </w:pPr>
+      <w:r>
+        <w:t xml:space="preserve">5.1 Выполнение лабораторной работы</w:t>
       </w:r>
     </w:p>
     <w:p>
@@ -496,107 +282,72 @@
         <w:pStyle w:val="FirstParagraph"/>
       </w:pPr>
       <w:r>
-        <w:t xml:space="preserve">Описываются проведённые действия, в качестве иллюстрации даётся ссылка на иллюстрацию (</w:t>
-      </w:r>
-      <w:hyperlink w:anchor="fig-001">
-        <w:r>
-          <w:rPr>
-            <w:rStyle w:val="Hyperlink"/>
-          </w:rPr>
-          <w:t xml:space="preserve">рис. 1</w:t>
-        </w:r>
-      </w:hyperlink>
-      <w:r>
-        <w:t xml:space="preserve">).</w:t>
-      </w:r>
-    </w:p>
-    <w:tbl>
-      <w:tblPr>
-        <w:tblStyle w:val="Table"/>
-        <w:tblW w:type="pct" w:w="5000"/>
-        <w:tblLayout w:type="fixed"/>
-        <w:tblLook w:firstRow="0" w:lastRow="0" w:firstColumn="0" w:lastColumn="0" w:noHBand="0" w:noVBand="0" w:val="0000"/>
-      </w:tblPr>
-      <w:tblGrid>
-        <w:gridCol w:w="7920"/>
-      </w:tblGrid>
-      <w:tr>
-        <w:tc>
-          <w:tcPr/>
-          <w:bookmarkStart w:id="16" w:name="fig-001"/>
-          <w:p>
-            <w:pPr>
-              <w:pStyle w:val="Compact"/>
-              <w:jc w:val="center"/>
-            </w:pPr>
-            <w:r>
-              <w:drawing>
-                <wp:inline>
-                  <wp:extent cx="3733800" cy="1938906"/>
-                  <wp:effectExtent b="0" l="0" r="0" t="0"/>
-                  <wp:docPr descr="" title="" id="14" name="Picture"/>
-                  <a:graphic>
-                    <a:graphicData uri="http://schemas.openxmlformats.org/drawingml/2006/picture">
-                      <pic:pic>
-                        <pic:nvPicPr>
-                          <pic:cNvPr descr="image/solvay.jpg" id="15" name="Picture"/>
-                          <pic:cNvPicPr>
-                            <a:picLocks noChangeArrowheads="1" noChangeAspect="1"/>
-                          </pic:cNvPicPr>
-                        </pic:nvPicPr>
-                        <pic:blipFill>
-                          <a:blip r:embed="rId13"/>
-                          <a:stretch>
-                            <a:fillRect/>
-                          </a:stretch>
-                        </pic:blipFill>
-                        <pic:spPr bwMode="auto">
-                          <a:xfrm>
-                            <a:off x="0" y="0"/>
-                            <a:ext cx="3733800" cy="1938906"/>
-                          </a:xfrm>
-                          <a:prstGeom prst="rect">
-                            <a:avLst/>
-                          </a:prstGeom>
-                          <a:noFill/>
-                          <a:ln w="9525">
-                            <a:noFill/>
-                            <a:headEnd/>
-                            <a:tailEnd/>
-                          </a:ln>
-                        </pic:spPr>
-                      </pic:pic>
-                    </a:graphicData>
-                  </a:graphic>
-                </wp:inline>
-              </w:drawing>
-            </w:r>
-          </w:p>
-          <w:p>
-            <w:pPr>
-              <w:jc w:val="center"/>
-            </w:pPr>
-            <w:pPr>
-              <w:jc w:val="left"/>
-              <w:spacing w:before="200"/>
-              <w:pStyle w:val="ImageCaption"/>
-            </w:pPr>
-            <w:r>
-              <w:t xml:space="preserve">Рисунок 1: V Сольвеевский конгресс (1927) «Электроны и фотоны»</w:t>
-            </w:r>
-          </w:p>
-          <w:bookmarkEnd w:id="16"/>
-        </w:tc>
-      </w:tr>
-    </w:tbl>
-    <w:bookmarkEnd w:id="17"/>
-    <w:bookmarkStart w:id="18" w:name="выводы"/>
-    <w:p>
-      <w:pPr>
-        <w:pStyle w:val="Heading1"/>
-      </w:pPr>
-      <w:r>
-        <w:t xml:space="preserve">5. Выводы</w:t>
+        <w:t xml:space="preserve">Создаю папку с проектом через Julia</w:t>
+      </w:r>
+    </w:p>
+    <w:p>
+      <w:pPr>
+        <w:pStyle w:val="CaptionedFigure"/>
+      </w:pPr>
+      <w:r>
+        <w:drawing>
+          <wp:inline>
+            <wp:extent cx="5334000" cy="2045117"/>
+            <wp:effectExtent b="0" l="0" r="0" t="0"/>
+            <wp:docPr descr="Создание папки" title="" id="16" name="Picture"/>
+            <a:graphic>
+              <a:graphicData uri="http://schemas.openxmlformats.org/drawingml/2006/picture">
+                <pic:pic>
+                  <pic:nvPicPr>
+                    <pic:cNvPr descr="image/1.png" id="17" name="Picture"/>
+                    <pic:cNvPicPr>
+                      <a:picLocks noChangeArrowheads="1" noChangeAspect="1"/>
+                    </pic:cNvPicPr>
+                  </pic:nvPicPr>
+                  <pic:blipFill>
+                    <a:blip r:embed="rId15"/>
+                    <a:stretch>
+                      <a:fillRect/>
+                    </a:stretch>
+                  </pic:blipFill>
+                  <pic:spPr bwMode="auto">
+                    <a:xfrm>
+                      <a:off x="0" y="0"/>
+                      <a:ext cx="5334000" cy="2045117"/>
+                    </a:xfrm>
+                    <a:prstGeom prst="rect">
+                      <a:avLst/>
+                    </a:prstGeom>
+                    <a:noFill/>
+                    <a:ln w="9525">
+                      <a:noFill/>
+                      <a:headEnd/>
+                      <a:tailEnd/>
+                    </a:ln>
+                  </pic:spPr>
+                </pic:pic>
+              </a:graphicData>
+            </a:graphic>
+          </wp:inline>
+        </w:drawing>
+      </w:r>
+    </w:p>
+    <w:p>
+      <w:pPr>
+        <w:pStyle w:val="ImageCaption"/>
+      </w:pPr>
+      <w:r>
+        <w:t xml:space="preserve">Создание папки</w:t>
+      </w:r>
+    </w:p>
+    <w:bookmarkEnd w:id="18"/>
+    <w:bookmarkStart w:id="22" w:name="выполнение-лабораторной-работы-2"/>
+    <w:p>
+      <w:pPr>
+        <w:pStyle w:val="Heading2"/>
+      </w:pPr>
+      <w:r>
+        <w:t xml:space="preserve">5.2 Выполнение лабораторной работы</w:t>
       </w:r>
     </w:p>
     <w:p>
@@ -604,121 +355,678 @@
         <w:pStyle w:val="FirstParagraph"/>
       </w:pPr>
       <w:r>
-        <w:t xml:space="preserve">Здесь кратко описываются итоги проделанной работы.</w:t>
-      </w:r>
-    </w:p>
-    <w:bookmarkEnd w:id="18"/>
-    <w:bookmarkStart w:id="25" w:name="список-литературы"/>
-    <w:p>
-      <w:pPr>
-        <w:pStyle w:val="Heading1"/>
-      </w:pPr>
-      <w:r>
-        <w:t xml:space="preserve">Список литературы</w:t>
-      </w:r>
-    </w:p>
-    <w:bookmarkStart w:id="24" w:name="refs"/>
-    <w:bookmarkStart w:id="19" w:name="ref-tanenbaum_book_modern-os_ru"/>
-    <w:p>
-      <w:pPr>
-        <w:pStyle w:val="Bibliography"/>
-      </w:pPr>
-      <w:r>
-        <w:t xml:space="preserve">1.</w:t>
-      </w:r>
-      <w:r>
-        <w:t xml:space="preserve"> </w:t>
-      </w:r>
-      <w:r>
-        <w:t xml:space="preserve">	</w:t>
-      </w:r>
-      <w:r>
-        <w:t xml:space="preserve">Таненбаум Э., Бос Х.</w:t>
-      </w:r>
-      <w:r>
-        <w:t xml:space="preserve"> </w:t>
-      </w:r>
-      <w:r>
-        <w:t xml:space="preserve">Современные операционные системы</w:t>
-      </w:r>
-      <w:r>
-        <w:t xml:space="preserve">. 4-е изд. СПб.: Питер, 2015. 1120 с.</w:t>
-      </w:r>
-    </w:p>
-    <w:bookmarkEnd w:id="19"/>
-    <w:bookmarkStart w:id="20" w:name="ref-robbins_book_bash_en"/>
-    <w:p>
-      <w:pPr>
-        <w:pStyle w:val="Bibliography"/>
-      </w:pPr>
-      <w:r>
-        <w:t xml:space="preserve">2.</w:t>
-      </w:r>
-      <w:r>
-        <w:t xml:space="preserve"> </w:t>
-      </w:r>
-      <w:r>
-        <w:t xml:space="preserve">	</w:t>
-      </w:r>
-      <w:r>
-        <w:t xml:space="preserve">Robbins A. Bash Pocket Reference. O’Reilly Media, 2016. 156 с.</w:t>
-      </w:r>
-    </w:p>
-    <w:bookmarkEnd w:id="20"/>
-    <w:bookmarkStart w:id="21" w:name="ref-zarrelli_book_mastering-bash_en"/>
-    <w:p>
-      <w:pPr>
-        <w:pStyle w:val="Bibliography"/>
-      </w:pPr>
-      <w:r>
-        <w:t xml:space="preserve">3.</w:t>
-      </w:r>
-      <w:r>
-        <w:t xml:space="preserve"> </w:t>
-      </w:r>
-      <w:r>
-        <w:t xml:space="preserve">	</w:t>
-      </w:r>
-      <w:r>
-        <w:t xml:space="preserve">Zarrelli G. Mastering Bash. Packt Publishing, 2017. 502 с.</w:t>
-      </w:r>
-    </w:p>
-    <w:bookmarkEnd w:id="21"/>
-    <w:bookmarkStart w:id="23" w:name="ref-newham_book_learning-bash_en"/>
-    <w:p>
-      <w:pPr>
-        <w:pStyle w:val="Bibliography"/>
-      </w:pPr>
-      <w:r>
-        <w:t xml:space="preserve">4.</w:t>
-      </w:r>
-      <w:r>
-        <w:t xml:space="preserve"> </w:t>
-      </w:r>
-      <w:r>
-        <w:t xml:space="preserve">	</w:t>
-      </w:r>
-      <w:r>
-        <w:t xml:space="preserve">Newham C.</w:t>
-      </w:r>
-      <w:r>
-        <w:t xml:space="preserve"> </w:t>
-      </w:r>
-      <w:hyperlink r:id="rId22">
-        <w:r>
-          <w:rPr>
-            <w:rStyle w:val="Hyperlink"/>
-          </w:rPr>
-          <w:t xml:space="preserve">Learning the bash Shell: Unix Shell Programming</w:t>
-        </w:r>
-      </w:hyperlink>
-      <w:r>
-        <w:t xml:space="preserve">. O’Reilly Media, 2005. 354 с.</w:t>
-      </w:r>
-    </w:p>
-    <w:bookmarkEnd w:id="23"/>
-    <w:bookmarkEnd w:id="24"/>
-    <w:bookmarkEnd w:id="25"/>
+        <w:t xml:space="preserve">Создаю первый скрипт с моделью SIR</w:t>
+      </w:r>
+    </w:p>
+    <w:p>
+      <w:pPr>
+        <w:pStyle w:val="CaptionedFigure"/>
+      </w:pPr>
+      <w:r>
+        <w:drawing>
+          <wp:inline>
+            <wp:extent cx="5334000" cy="4287883"/>
+            <wp:effectExtent b="0" l="0" r="0" t="0"/>
+            <wp:docPr descr="SIR" title="" id="20" name="Picture"/>
+            <a:graphic>
+              <a:graphicData uri="http://schemas.openxmlformats.org/drawingml/2006/picture">
+                <pic:pic>
+                  <pic:nvPicPr>
+                    <pic:cNvPr descr="image/2.png" id="21" name="Picture"/>
+                    <pic:cNvPicPr>
+                      <a:picLocks noChangeArrowheads="1" noChangeAspect="1"/>
+                    </pic:cNvPicPr>
+                  </pic:nvPicPr>
+                  <pic:blipFill>
+                    <a:blip r:embed="rId19"/>
+                    <a:stretch>
+                      <a:fillRect/>
+                    </a:stretch>
+                  </pic:blipFill>
+                  <pic:spPr bwMode="auto">
+                    <a:xfrm>
+                      <a:off x="0" y="0"/>
+                      <a:ext cx="5334000" cy="4287883"/>
+                    </a:xfrm>
+                    <a:prstGeom prst="rect">
+                      <a:avLst/>
+                    </a:prstGeom>
+                    <a:noFill/>
+                    <a:ln w="9525">
+                      <a:noFill/>
+                      <a:headEnd/>
+                      <a:tailEnd/>
+                    </a:ln>
+                  </pic:spPr>
+                </pic:pic>
+              </a:graphicData>
+            </a:graphic>
+          </wp:inline>
+        </w:drawing>
+      </w:r>
+    </w:p>
+    <w:p>
+      <w:pPr>
+        <w:pStyle w:val="ImageCaption"/>
+      </w:pPr>
+      <w:r>
+        <w:t xml:space="preserve">SIR</w:t>
+      </w:r>
+    </w:p>
+    <w:bookmarkEnd w:id="22"/>
+    <w:bookmarkStart w:id="26" w:name="выполнение-лабораторной-работы-3"/>
+    <w:p>
+      <w:pPr>
+        <w:pStyle w:val="Heading2"/>
+      </w:pPr>
+      <w:r>
+        <w:t xml:space="preserve">5.3 Выполнение лабораторной работы</w:t>
+      </w:r>
+    </w:p>
+    <w:p>
+      <w:pPr>
+        <w:pStyle w:val="FirstParagraph"/>
+      </w:pPr>
+      <w:r>
+        <w:t xml:space="preserve">Преобразовываю его в литературный код</w:t>
+      </w:r>
+    </w:p>
+    <w:p>
+      <w:pPr>
+        <w:pStyle w:val="CaptionedFigure"/>
+      </w:pPr>
+      <w:r>
+        <w:drawing>
+          <wp:inline>
+            <wp:extent cx="5334000" cy="3740261"/>
+            <wp:effectExtent b="0" l="0" r="0" t="0"/>
+            <wp:docPr descr="Литературный код" title="" id="24" name="Picture"/>
+            <a:graphic>
+              <a:graphicData uri="http://schemas.openxmlformats.org/drawingml/2006/picture">
+                <pic:pic>
+                  <pic:nvPicPr>
+                    <pic:cNvPr descr="image/10.png" id="25" name="Picture"/>
+                    <pic:cNvPicPr>
+                      <a:picLocks noChangeArrowheads="1" noChangeAspect="1"/>
+                    </pic:cNvPicPr>
+                  </pic:nvPicPr>
+                  <pic:blipFill>
+                    <a:blip r:embed="rId23"/>
+                    <a:stretch>
+                      <a:fillRect/>
+                    </a:stretch>
+                  </pic:blipFill>
+                  <pic:spPr bwMode="auto">
+                    <a:xfrm>
+                      <a:off x="0" y="0"/>
+                      <a:ext cx="5334000" cy="3740261"/>
+                    </a:xfrm>
+                    <a:prstGeom prst="rect">
+                      <a:avLst/>
+                    </a:prstGeom>
+                    <a:noFill/>
+                    <a:ln w="9525">
+                      <a:noFill/>
+                      <a:headEnd/>
+                      <a:tailEnd/>
+                    </a:ln>
+                  </pic:spPr>
+                </pic:pic>
+              </a:graphicData>
+            </a:graphic>
+          </wp:inline>
+        </w:drawing>
+      </w:r>
+    </w:p>
+    <w:p>
+      <w:pPr>
+        <w:pStyle w:val="ImageCaption"/>
+      </w:pPr>
+      <w:r>
+        <w:t xml:space="preserve">Литературный код</w:t>
+      </w:r>
+    </w:p>
+    <w:bookmarkEnd w:id="26"/>
+    <w:bookmarkStart w:id="30" w:name="выполнение-лабораторной-работы-4"/>
+    <w:p>
+      <w:pPr>
+        <w:pStyle w:val="Heading2"/>
+      </w:pPr>
+      <w:r>
+        <w:t xml:space="preserve">5.4 Выполнение лабораторной работы</w:t>
+      </w:r>
+    </w:p>
+    <w:p>
+      <w:pPr>
+        <w:pStyle w:val="FirstParagraph"/>
+      </w:pPr>
+      <w:r>
+        <w:t xml:space="preserve">Далее запускаю скрипт с моделью</w:t>
+      </w:r>
+    </w:p>
+    <w:p>
+      <w:pPr>
+        <w:pStyle w:val="CaptionedFigure"/>
+      </w:pPr>
+      <w:r>
+        <w:drawing>
+          <wp:inline>
+            <wp:extent cx="5334000" cy="2276474"/>
+            <wp:effectExtent b="0" l="0" r="0" t="0"/>
+            <wp:docPr descr="Запуск скрипта" title="" id="28" name="Picture"/>
+            <a:graphic>
+              <a:graphicData uri="http://schemas.openxmlformats.org/drawingml/2006/picture">
+                <pic:pic>
+                  <pic:nvPicPr>
+                    <pic:cNvPr descr="image/3.png" id="29" name="Picture"/>
+                    <pic:cNvPicPr>
+                      <a:picLocks noChangeArrowheads="1" noChangeAspect="1"/>
+                    </pic:cNvPicPr>
+                  </pic:nvPicPr>
+                  <pic:blipFill>
+                    <a:blip r:embed="rId27"/>
+                    <a:stretch>
+                      <a:fillRect/>
+                    </a:stretch>
+                  </pic:blipFill>
+                  <pic:spPr bwMode="auto">
+                    <a:xfrm>
+                      <a:off x="0" y="0"/>
+                      <a:ext cx="5334000" cy="2276474"/>
+                    </a:xfrm>
+                    <a:prstGeom prst="rect">
+                      <a:avLst/>
+                    </a:prstGeom>
+                    <a:noFill/>
+                    <a:ln w="9525">
+                      <a:noFill/>
+                      <a:headEnd/>
+                      <a:tailEnd/>
+                    </a:ln>
+                  </pic:spPr>
+                </pic:pic>
+              </a:graphicData>
+            </a:graphic>
+          </wp:inline>
+        </w:drawing>
+      </w:r>
+    </w:p>
+    <w:p>
+      <w:pPr>
+        <w:pStyle w:val="ImageCaption"/>
+      </w:pPr>
+      <w:r>
+        <w:t xml:space="preserve">Запуск скрипта</w:t>
+      </w:r>
+    </w:p>
+    <w:bookmarkEnd w:id="30"/>
+    <w:bookmarkStart w:id="34" w:name="выполнение-лабораторной-работы-5"/>
+    <w:p>
+      <w:pPr>
+        <w:pStyle w:val="Heading2"/>
+      </w:pPr>
+      <w:r>
+        <w:t xml:space="preserve">5.5 Выполнение лабораторной работы</w:t>
+      </w:r>
+    </w:p>
+    <w:p>
+      <w:pPr>
+        <w:pStyle w:val="FirstParagraph"/>
+      </w:pPr>
+      <w:r>
+        <w:t xml:space="preserve">Создаю все производные из литературного кода</w:t>
+      </w:r>
+    </w:p>
+    <w:p>
+      <w:pPr>
+        <w:pStyle w:val="CaptionedFigure"/>
+      </w:pPr>
+      <w:r>
+        <w:drawing>
+          <wp:inline>
+            <wp:extent cx="5334000" cy="1552059"/>
+            <wp:effectExtent b="0" l="0" r="0" t="0"/>
+            <wp:docPr descr="Создание файлов" title="" id="32" name="Picture"/>
+            <a:graphic>
+              <a:graphicData uri="http://schemas.openxmlformats.org/drawingml/2006/picture">
+                <pic:pic>
+                  <pic:nvPicPr>
+                    <pic:cNvPr descr="image/4.png" id="33" name="Picture"/>
+                    <pic:cNvPicPr>
+                      <a:picLocks noChangeArrowheads="1" noChangeAspect="1"/>
+                    </pic:cNvPicPr>
+                  </pic:nvPicPr>
+                  <pic:blipFill>
+                    <a:blip r:embed="rId31"/>
+                    <a:stretch>
+                      <a:fillRect/>
+                    </a:stretch>
+                  </pic:blipFill>
+                  <pic:spPr bwMode="auto">
+                    <a:xfrm>
+                      <a:off x="0" y="0"/>
+                      <a:ext cx="5334000" cy="1552059"/>
+                    </a:xfrm>
+                    <a:prstGeom prst="rect">
+                      <a:avLst/>
+                    </a:prstGeom>
+                    <a:noFill/>
+                    <a:ln w="9525">
+                      <a:noFill/>
+                      <a:headEnd/>
+                      <a:tailEnd/>
+                    </a:ln>
+                  </pic:spPr>
+                </pic:pic>
+              </a:graphicData>
+            </a:graphic>
+          </wp:inline>
+        </w:drawing>
+      </w:r>
+    </w:p>
+    <w:p>
+      <w:pPr>
+        <w:pStyle w:val="ImageCaption"/>
+      </w:pPr>
+      <w:r>
+        <w:t xml:space="preserve">Создание файлов</w:t>
+      </w:r>
+    </w:p>
+    <w:bookmarkEnd w:id="34"/>
+    <w:bookmarkStart w:id="38" w:name="выполнение-лабораторной-работы-6"/>
+    <w:p>
+      <w:pPr>
+        <w:pStyle w:val="Heading2"/>
+      </w:pPr>
+      <w:r>
+        <w:t xml:space="preserve">5.6 Выполнение лабораторной работы</w:t>
+      </w:r>
+    </w:p>
+    <w:p>
+      <w:pPr>
+        <w:pStyle w:val="FirstParagraph"/>
+      </w:pPr>
+      <w:r>
+        <w:t xml:space="preserve">Проверяю созданый файл в юпитере и запускаю его.</w:t>
+      </w:r>
+    </w:p>
+    <w:p>
+      <w:pPr>
+        <w:pStyle w:val="CaptionedFigure"/>
+      </w:pPr>
+      <w:r>
+        <w:drawing>
+          <wp:inline>
+            <wp:extent cx="5334000" cy="2577394"/>
+            <wp:effectExtent b="0" l="0" r="0" t="0"/>
+            <wp:docPr descr="Юпитер ноутбук" title="" id="36" name="Picture"/>
+            <a:graphic>
+              <a:graphicData uri="http://schemas.openxmlformats.org/drawingml/2006/picture">
+                <pic:pic>
+                  <pic:nvPicPr>
+                    <pic:cNvPr descr="image/5.png" id="37" name="Picture"/>
+                    <pic:cNvPicPr>
+                      <a:picLocks noChangeArrowheads="1" noChangeAspect="1"/>
+                    </pic:cNvPicPr>
+                  </pic:nvPicPr>
+                  <pic:blipFill>
+                    <a:blip r:embed="rId35"/>
+                    <a:stretch>
+                      <a:fillRect/>
+                    </a:stretch>
+                  </pic:blipFill>
+                  <pic:spPr bwMode="auto">
+                    <a:xfrm>
+                      <a:off x="0" y="0"/>
+                      <a:ext cx="5334000" cy="2577394"/>
+                    </a:xfrm>
+                    <a:prstGeom prst="rect">
+                      <a:avLst/>
+                    </a:prstGeom>
+                    <a:noFill/>
+                    <a:ln w="9525">
+                      <a:noFill/>
+                      <a:headEnd/>
+                      <a:tailEnd/>
+                    </a:ln>
+                  </pic:spPr>
+                </pic:pic>
+              </a:graphicData>
+            </a:graphic>
+          </wp:inline>
+        </w:drawing>
+      </w:r>
+    </w:p>
+    <w:p>
+      <w:pPr>
+        <w:pStyle w:val="ImageCaption"/>
+      </w:pPr>
+      <w:r>
+        <w:t xml:space="preserve">Юпитер ноутбук</w:t>
+      </w:r>
+    </w:p>
+    <w:bookmarkEnd w:id="38"/>
+    <w:bookmarkStart w:id="42" w:name="выполнение-лабораторной-работы-7"/>
+    <w:p>
+      <w:pPr>
+        <w:pStyle w:val="Heading2"/>
+      </w:pPr>
+      <w:r>
+        <w:t xml:space="preserve">5.7 Выполнение лабораторной работы</w:t>
+      </w:r>
+    </w:p>
+    <w:p>
+      <w:pPr>
+        <w:pStyle w:val="FirstParagraph"/>
+      </w:pPr>
+      <w:r>
+        <w:t xml:space="preserve">Далее создаю литературный код для второго скрипта с моделью Лотки–Вольтерры</w:t>
+      </w:r>
+    </w:p>
+    <w:p>
+      <w:pPr>
+        <w:pStyle w:val="CaptionedFigure"/>
+      </w:pPr>
+      <w:r>
+        <w:drawing>
+          <wp:inline>
+            <wp:extent cx="5334000" cy="3690055"/>
+            <wp:effectExtent b="0" l="0" r="0" t="0"/>
+            <wp:docPr descr="Создание литературного кода" title="" id="40" name="Picture"/>
+            <a:graphic>
+              <a:graphicData uri="http://schemas.openxmlformats.org/drawingml/2006/picture">
+                <pic:pic>
+                  <pic:nvPicPr>
+                    <pic:cNvPr descr="image/9.png" id="41" name="Picture"/>
+                    <pic:cNvPicPr>
+                      <a:picLocks noChangeArrowheads="1" noChangeAspect="1"/>
+                    </pic:cNvPicPr>
+                  </pic:nvPicPr>
+                  <pic:blipFill>
+                    <a:blip r:embed="rId39"/>
+                    <a:stretch>
+                      <a:fillRect/>
+                    </a:stretch>
+                  </pic:blipFill>
+                  <pic:spPr bwMode="auto">
+                    <a:xfrm>
+                      <a:off x="0" y="0"/>
+                      <a:ext cx="5334000" cy="3690055"/>
+                    </a:xfrm>
+                    <a:prstGeom prst="rect">
+                      <a:avLst/>
+                    </a:prstGeom>
+                    <a:noFill/>
+                    <a:ln w="9525">
+                      <a:noFill/>
+                      <a:headEnd/>
+                      <a:tailEnd/>
+                    </a:ln>
+                  </pic:spPr>
+                </pic:pic>
+              </a:graphicData>
+            </a:graphic>
+          </wp:inline>
+        </w:drawing>
+      </w:r>
+    </w:p>
+    <w:p>
+      <w:pPr>
+        <w:pStyle w:val="ImageCaption"/>
+      </w:pPr>
+      <w:r>
+        <w:t xml:space="preserve">Создание литературного кода</w:t>
+      </w:r>
+    </w:p>
+    <w:bookmarkEnd w:id="42"/>
+    <w:bookmarkStart w:id="46" w:name="выполнение-лабораторной-работы-8"/>
+    <w:p>
+      <w:pPr>
+        <w:pStyle w:val="Heading2"/>
+      </w:pPr>
+      <w:r>
+        <w:t xml:space="preserve">5.8 Выполнение лабораторной работы</w:t>
+      </w:r>
+    </w:p>
+    <w:p>
+      <w:pPr>
+        <w:pStyle w:val="FirstParagraph"/>
+      </w:pPr>
+      <w:r>
+        <w:t xml:space="preserve">Запускаю данную модель</w:t>
+      </w:r>
+    </w:p>
+    <w:p>
+      <w:pPr>
+        <w:pStyle w:val="CaptionedFigure"/>
+      </w:pPr>
+      <w:r>
+        <w:drawing>
+          <wp:inline>
+            <wp:extent cx="5334000" cy="1119301"/>
+            <wp:effectExtent b="0" l="0" r="0" t="0"/>
+            <wp:docPr descr="Запуск модели" title="" id="44" name="Picture"/>
+            <a:graphic>
+              <a:graphicData uri="http://schemas.openxmlformats.org/drawingml/2006/picture">
+                <pic:pic>
+                  <pic:nvPicPr>
+                    <pic:cNvPr descr="image/6.png" id="45" name="Picture"/>
+                    <pic:cNvPicPr>
+                      <a:picLocks noChangeArrowheads="1" noChangeAspect="1"/>
+                    </pic:cNvPicPr>
+                  </pic:nvPicPr>
+                  <pic:blipFill>
+                    <a:blip r:embed="rId43"/>
+                    <a:stretch>
+                      <a:fillRect/>
+                    </a:stretch>
+                  </pic:blipFill>
+                  <pic:spPr bwMode="auto">
+                    <a:xfrm>
+                      <a:off x="0" y="0"/>
+                      <a:ext cx="5334000" cy="1119301"/>
+                    </a:xfrm>
+                    <a:prstGeom prst="rect">
+                      <a:avLst/>
+                    </a:prstGeom>
+                    <a:noFill/>
+                    <a:ln w="9525">
+                      <a:noFill/>
+                      <a:headEnd/>
+                      <a:tailEnd/>
+                    </a:ln>
+                  </pic:spPr>
+                </pic:pic>
+              </a:graphicData>
+            </a:graphic>
+          </wp:inline>
+        </w:drawing>
+      </w:r>
+    </w:p>
+    <w:p>
+      <w:pPr>
+        <w:pStyle w:val="ImageCaption"/>
+      </w:pPr>
+      <w:r>
+        <w:t xml:space="preserve">Запуск модели</w:t>
+      </w:r>
+    </w:p>
+    <w:bookmarkEnd w:id="46"/>
+    <w:bookmarkStart w:id="50" w:name="выполнение-лабораторной-работы-9"/>
+    <w:p>
+      <w:pPr>
+        <w:pStyle w:val="Heading2"/>
+      </w:pPr>
+      <w:r>
+        <w:t xml:space="preserve">5.9 Выполнение лабораторной работы</w:t>
+      </w:r>
+    </w:p>
+    <w:p>
+      <w:pPr>
+        <w:pStyle w:val="FirstParagraph"/>
+      </w:pPr>
+      <w:r>
+        <w:t xml:space="preserve">Создаю все необходимые файлы из литературного кода</w:t>
+      </w:r>
+    </w:p>
+    <w:p>
+      <w:pPr>
+        <w:pStyle w:val="CaptionedFigure"/>
+      </w:pPr>
+      <w:r>
+        <w:drawing>
+          <wp:inline>
+            <wp:extent cx="5334000" cy="1119301"/>
+            <wp:effectExtent b="0" l="0" r="0" t="0"/>
+            <wp:docPr descr="Создание файлов" title="" id="48" name="Picture"/>
+            <a:graphic>
+              <a:graphicData uri="http://schemas.openxmlformats.org/drawingml/2006/picture">
+                <pic:pic>
+                  <pic:nvPicPr>
+                    <pic:cNvPr descr="image/7.png" id="49" name="Picture"/>
+                    <pic:cNvPicPr>
+                      <a:picLocks noChangeArrowheads="1" noChangeAspect="1"/>
+                    </pic:cNvPicPr>
+                  </pic:nvPicPr>
+                  <pic:blipFill>
+                    <a:blip r:embed="rId47"/>
+                    <a:stretch>
+                      <a:fillRect/>
+                    </a:stretch>
+                  </pic:blipFill>
+                  <pic:spPr bwMode="auto">
+                    <a:xfrm>
+                      <a:off x="0" y="0"/>
+                      <a:ext cx="5334000" cy="1119301"/>
+                    </a:xfrm>
+                    <a:prstGeom prst="rect">
+                      <a:avLst/>
+                    </a:prstGeom>
+                    <a:noFill/>
+                    <a:ln w="9525">
+                      <a:noFill/>
+                      <a:headEnd/>
+                      <a:tailEnd/>
+                    </a:ln>
+                  </pic:spPr>
+                </pic:pic>
+              </a:graphicData>
+            </a:graphic>
+          </wp:inline>
+        </w:drawing>
+      </w:r>
+    </w:p>
+    <w:p>
+      <w:pPr>
+        <w:pStyle w:val="ImageCaption"/>
+      </w:pPr>
+      <w:r>
+        <w:t xml:space="preserve">Создание файлов</w:t>
+      </w:r>
+    </w:p>
+    <w:bookmarkEnd w:id="50"/>
+    <w:bookmarkStart w:id="54" w:name="выполнение-лабораторной-работы-10"/>
+    <w:p>
+      <w:pPr>
+        <w:pStyle w:val="Heading2"/>
+      </w:pPr>
+      <w:r>
+        <w:t xml:space="preserve">5.10 Выполнение лабораторной работы</w:t>
+      </w:r>
+    </w:p>
+    <w:p>
+      <w:pPr>
+        <w:pStyle w:val="FirstParagraph"/>
+      </w:pPr>
+      <w:r>
+        <w:t xml:space="preserve">Запускаю получившийся файл в юпитере</w:t>
+      </w:r>
+    </w:p>
+    <w:p>
+      <w:pPr>
+        <w:pStyle w:val="CaptionedFigure"/>
+      </w:pPr>
+      <w:r>
+        <w:drawing>
+          <wp:inline>
+            <wp:extent cx="5334000" cy="3426646"/>
+            <wp:effectExtent b="0" l="0" r="0" t="0"/>
+            <wp:docPr descr="Юпитер ноутбук" title="" id="52" name="Picture"/>
+            <a:graphic>
+              <a:graphicData uri="http://schemas.openxmlformats.org/drawingml/2006/picture">
+                <pic:pic>
+                  <pic:nvPicPr>
+                    <pic:cNvPr descr="image/8.png" id="53" name="Picture"/>
+                    <pic:cNvPicPr>
+                      <a:picLocks noChangeArrowheads="1" noChangeAspect="1"/>
+                    </pic:cNvPicPr>
+                  </pic:nvPicPr>
+                  <pic:blipFill>
+                    <a:blip r:embed="rId51"/>
+                    <a:stretch>
+                      <a:fillRect/>
+                    </a:stretch>
+                  </pic:blipFill>
+                  <pic:spPr bwMode="auto">
+                    <a:xfrm>
+                      <a:off x="0" y="0"/>
+                      <a:ext cx="5334000" cy="3426646"/>
+                    </a:xfrm>
+                    <a:prstGeom prst="rect">
+                      <a:avLst/>
+                    </a:prstGeom>
+                    <a:noFill/>
+                    <a:ln w="9525">
+                      <a:noFill/>
+                      <a:headEnd/>
+                      <a:tailEnd/>
+                    </a:ln>
+                  </pic:spPr>
+                </pic:pic>
+              </a:graphicData>
+            </a:graphic>
+          </wp:inline>
+        </w:drawing>
+      </w:r>
+    </w:p>
+    <w:p>
+      <w:pPr>
+        <w:pStyle w:val="ImageCaption"/>
+      </w:pPr>
+      <w:r>
+        <w:t xml:space="preserve">Юпитер ноутбук</w:t>
+      </w:r>
+    </w:p>
+    <w:bookmarkEnd w:id="54"/>
+    <w:bookmarkStart w:id="55" w:name="выполнение-лабораторной-работы-11"/>
+    <w:p>
+      <w:pPr>
+        <w:pStyle w:val="Heading2"/>
+      </w:pPr>
+      <w:r>
+        <w:t xml:space="preserve">5.11 Выполнение лабораторной работы</w:t>
+      </w:r>
+    </w:p>
+    <w:bookmarkEnd w:id="55"/>
+    <w:bookmarkStart w:id="56" w:name="выводы"/>
+    <w:p>
+      <w:pPr>
+        <w:pStyle w:val="Heading2"/>
+      </w:pPr>
+      <w:r>
+        <w:t xml:space="preserve">5.12 Выводы</w:t>
+      </w:r>
+    </w:p>
+    <w:p>
+      <w:pPr>
+        <w:pStyle w:val="FirstParagraph"/>
+      </w:pPr>
+      <w:r>
+        <w:t xml:space="preserve">После выполнения данный лабораторной работы я изучил модели SIR и Лотки–Вольтерры</w:t>
+      </w:r>
+    </w:p>
+    <w:bookmarkEnd w:id="56"/>
+    <w:bookmarkEnd w:id="57"/>
     <w:sectPr>
       <w:footnotePr>
         <w:numRestart w:val="eachSect"/>
@@ -829,8 +1137,114 @@
       </w:pPr>
     </w:lvl>
   </w:abstractNum>
+  <w:abstractNum w:abstractNumId="991">
+    <w:nsid w:val="0000A991"/>
+    <w:multiLevelType w:val="multilevel"/>
+    <w:lvl w:ilvl="0">
+      <w:numFmt w:val="bullet"/>
+      <w:lvlText w:val=""/>
+      <w:lvlJc w:val="left"/>
+      <w:pPr>
+        <w:ind w:left="720" w:hanging="360"/>
+      </w:pPr>
+      <w:rPr>
+        <w:rFonts w:ascii="Symbol" w:hAnsi="Symbol" w:cs="Symbol" w:hint="default"/>
+      </w:rPr>
+    </w:lvl>
+    <w:lvl w:ilvl="1">
+      <w:numFmt w:val="bullet"/>
+      <w:lvlText w:val="o"/>
+      <w:lvlJc w:val="left"/>
+      <w:pPr>
+        <w:ind w:left="1440" w:hanging="360"/>
+      </w:pPr>
+      <w:rPr>
+        <w:rFonts w:ascii="Courier New" w:hAnsi="Courier New" w:cs="Courier New" w:hint="default"/>
+      </w:rPr>
+    </w:lvl>
+    <w:lvl w:ilvl="2">
+      <w:numFmt w:val="bullet"/>
+      <w:lvlText w:val=""/>
+      <w:lvlJc w:val="left"/>
+      <w:pPr>
+        <w:ind w:left="2160" w:hanging="360"/>
+      </w:pPr>
+      <w:rPr>
+        <w:rFonts w:ascii="Wingdings" w:hAnsi="Wingdings" w:cs="Wingdings" w:hint="default"/>
+      </w:rPr>
+    </w:lvl>
+    <w:lvl w:ilvl="3">
+      <w:numFmt w:val="bullet"/>
+      <w:lvlText w:val=""/>
+      <w:lvlJc w:val="left"/>
+      <w:pPr>
+        <w:ind w:left="2880" w:hanging="360"/>
+      </w:pPr>
+      <w:rPr>
+        <w:rFonts w:ascii="Symbol" w:hAnsi="Symbol" w:cs="Symbol" w:hint="default"/>
+      </w:rPr>
+    </w:lvl>
+    <w:lvl w:ilvl="4">
+      <w:numFmt w:val="bullet"/>
+      <w:lvlText w:val="o"/>
+      <w:lvlJc w:val="left"/>
+      <w:pPr>
+        <w:ind w:left="3600" w:hanging="360"/>
+      </w:pPr>
+      <w:rPr>
+        <w:rFonts w:ascii="Courier New" w:hAnsi="Courier New" w:cs="Courier New" w:hint="default"/>
+      </w:rPr>
+    </w:lvl>
+    <w:lvl w:ilvl="5">
+      <w:numFmt w:val="bullet"/>
+      <w:lvlText w:val=""/>
+      <w:lvlJc w:val="left"/>
+      <w:pPr>
+        <w:ind w:left="4320" w:hanging="360"/>
+      </w:pPr>
+      <w:rPr>
+        <w:rFonts w:ascii="Wingdings" w:hAnsi="Wingdings" w:cs="Wingdings" w:hint="default"/>
+      </w:rPr>
+    </w:lvl>
+    <w:lvl w:ilvl="6">
+      <w:numFmt w:val="bullet"/>
+      <w:lvlText w:val=""/>
+      <w:lvlJc w:val="left"/>
+      <w:pPr>
+        <w:ind w:left="5040" w:hanging="360"/>
+      </w:pPr>
+      <w:rPr>
+        <w:rFonts w:ascii="Symbol" w:hAnsi="Symbol" w:cs="Symbol" w:hint="default"/>
+      </w:rPr>
+    </w:lvl>
+    <w:lvl w:ilvl="7">
+      <w:numFmt w:val="bullet"/>
+      <w:lvlText w:val="o"/>
+      <w:lvlJc w:val="left"/>
+      <w:pPr>
+        <w:ind w:left="5760" w:hanging="360"/>
+      </w:pPr>
+      <w:rPr>
+        <w:rFonts w:ascii="Courier New" w:hAnsi="Courier New" w:cs="Courier New" w:hint="default"/>
+      </w:rPr>
+    </w:lvl>
+    <w:lvl w:ilvl="8">
+      <w:numFmt w:val="bullet"/>
+      <w:lvlText w:val=""/>
+      <w:lvlJc w:val="left"/>
+      <w:pPr>
+        <w:ind w:left="6480" w:hanging="360"/>
+      </w:pPr>
+      <w:rPr>
+        <w:rFonts w:ascii="Wingdings" w:hAnsi="Wingdings" w:cs="Wingdings" w:hint="default"/>
+      </w:rPr>
+    </w:lvl>
+  </w:abstractNum>
   <w:num w:numId="1000">
     <w:abstractNumId w:val="990"/>
+  </w:num>
+  <w:num w:numId="1001">
+    <w:abstractNumId w:val="991"/>
   </w:num>
 </w:numbering>
 </file>

</xml_diff>